<commit_message>
Add script to optimize global Photutils parameters for foreground masking
- Implemented a new Python script `optimise_photutils_global_parameters.py` that scores global Photutils parameter sets using spike and no-spike controls.
- The script includes functions for loading necessary modules, profiling arrays, detecting spikes, evaluating parameters, and generating a summary of results.
- Added command-line argument parsing for various optimization parameters, including nsigma, dilation, max area, and elongation.
- Outputs detailed results and summary to CSV files for further analysis.
</commit_message>
<xml_diff>
--- a/Foreground Masking/documentation/Bar Spike-Gated Foreground Candidate Report Documentation.docx
+++ b/Foreground Masking/documentation/Bar Spike-Gated Foreground Candidate Report Documentation.docx
@@ -2623,7 +2623,7 @@
               <w:rPr>
                 <w:b/>
               </w:rPr>
-              <w:t>Top image panel</w:t>
+              <w:t>Observed image panel</w:t>
             </w:r>
           </w:p>
         </w:tc>
@@ -2640,7 +2640,50 @@
           </w:tcPr>
           <w:p>
             <w:r>
-              <w:t>S4G 3.6 micron isophote image with bar-major and bar-minor axes overlaid. Retained foreground objects are circled in red.</w:t>
+              <w:t>S4G 3.6 micron isophote image in the observed sky plane with bar-major and bar-minor axes overlaid. Retained foreground candidates are circled in red.</w:t>
+            </w:r>
+          </w:p>
+        </w:tc>
+      </w:tr>
+      <w:tr>
+        <w:trPr>
+          <w:cantSplit/>
+        </w:trPr>
+        <w:tc>
+          <w:tcPr>
+            <w:tcW w:type="dxa" w:w="2400"/>
+            <w:shd w:fill="F2F4F7"/>
+            <w:vAlign w:val="center"/>
+            <w:tcMar>
+              <w:top w:w="80" w:type="dxa"/>
+              <w:bottom w:w="80" w:type="dxa"/>
+              <w:start w:w="120" w:type="dxa"/>
+              <w:end w:w="120" w:type="dxa"/>
+            </w:tcMar>
+          </w:tcPr>
+          <w:p>
+            <w:r>
+              <w:rPr>
+                <w:b/>
+              </w:rPr>
+              <w:t>Deprojected image panel</w:t>
+            </w:r>
+          </w:p>
+        </w:tc>
+        <w:tc>
+          <w:tcPr>
+            <w:tcW w:type="dxa" w:w="6960"/>
+            <w:vAlign w:val="center"/>
+            <w:tcMar>
+              <w:top w:w="80" w:type="dxa"/>
+              <w:bottom w:w="80" w:type="dxa"/>
+              <w:start w:w="120" w:type="dxa"/>
+              <w:end w:w="120" w:type="dxa"/>
+            </w:tcMar>
+          </w:tcPr>
+          <w:p>
+            <w:r>
+              <w:t>Second isophote panel sampled in the face-on disk plane and rotated so the bar major axis is horizontal. The same retained red-circle candidates are transformed into this coordinate system.</w:t>
             </w:r>
           </w:p>
         </w:tc>
@@ -3603,7 +3646,50 @@
           </w:tcPr>
           <w:p>
             <w:r>
-              <w:t>python "Foreground Masking/bar_spike_gated_foreground_report.py" --all --auto-tune</w:t>
+              <w:t>python "Foreground Masking/bar_spike_gated_foreground_report.py" --all --detection-nsigma 3.5 --output-dir "D:\Dropbox\Public Documents\UCLAN\MSc Research\Remove foreground objects\spike_gated_3p5_sigma"</w:t>
+            </w:r>
+          </w:p>
+        </w:tc>
+      </w:tr>
+      <w:tr>
+        <w:trPr>
+          <w:cantSplit/>
+        </w:trPr>
+        <w:tc>
+          <w:tcPr>
+            <w:tcW w:type="dxa" w:w="2500"/>
+            <w:shd w:fill="F2F4F7"/>
+            <w:vAlign w:val="center"/>
+            <w:tcMar>
+              <w:top w:w="80" w:type="dxa"/>
+              <w:bottom w:w="80" w:type="dxa"/>
+              <w:start w:w="120" w:type="dxa"/>
+              <w:end w:w="120" w:type="dxa"/>
+            </w:tcMar>
+          </w:tcPr>
+          <w:p>
+            <w:r>
+              <w:rPr>
+                <w:b/>
+              </w:rPr>
+              <w:t>Run global Photutils at 3.5 sigma</w:t>
+            </w:r>
+          </w:p>
+        </w:tc>
+        <w:tc>
+          <w:tcPr>
+            <w:tcW w:type="dxa" w:w="6860"/>
+            <w:vAlign w:val="center"/>
+            <w:tcMar>
+              <w:top w:w="80" w:type="dxa"/>
+              <w:bottom w:w="80" w:type="dxa"/>
+              <w:start w:w="120" w:type="dxa"/>
+              <w:end w:w="120" w:type="dxa"/>
+            </w:tcMar>
+          </w:tcPr>
+          <w:p>
+            <w:r>
+              <w:t>python "Foreground Masking/bar_spike_gated_foreground_report.py" --all --masking-mode global --detection-nsigma 3.5 --output-dir "D:\Dropbox\Public Documents\UCLAN\MSc Research\Remove foreground objects\global_photutils_3p5_sigma"</w:t>
             </w:r>
           </w:p>
         </w:tc>

</xml_diff>

<commit_message>
updated documentation and resolved angle_utils issue
</commit_message>
<xml_diff>
--- a/Foreground Masking/documentation/Bar Spike-Gated Foreground Candidate Report Documentation.docx
+++ b/Foreground Masking/documentation/Bar Spike-Gated Foreground Candidate Report Documentation.docx
@@ -211,7 +211,7 @@
           </w:tcPr>
           <w:p>
             <w:r>
-              <w:t>2026-07-05</w:t>
+              <w:t>2026-07-08</w:t>
             </w:r>
           </w:p>
         </w:tc>
@@ -4566,7 +4566,7 @@
               <w:rPr>
                 <w:b/>
               </w:rPr>
-              <w:t>{galaxy_name}_foreground_removed.pdf</w:t>
+              <w:t>{galaxy_name}_fg_removed_sp-gated.pdf and .png</w:t>
             </w:r>
           </w:p>
         </w:tc>
@@ -4583,7 +4583,7 @@
           </w:tcPr>
           <w:p>
             <w:r>
-              <w:t>Portrait report for one galaxy. The filename is historical shorthand; the current default content is spike-gated profile-contamination correction, not complete image-wide foreground removal.</w:t>
+              <w:t>Portrait report and PNG preview for one galaxy. The method suffix identifies the spike-gated masking run.</w:t>
             </w:r>
           </w:p>
         </w:tc>
@@ -4626,7 +4626,7 @@
           </w:tcPr>
           <w:p>
             <w:r>
-              <w:t>D:\Dropbox\Public Documents\UCLAN\MSc Research\Remove foreground objects\calibrated spike_rule</w:t>
+              <w:t>D:\Dropbox\Public Documents\UCLAN\MSc Research\Remove foreground objects\spike_gated_auto_tuned</w:t>
             </w:r>
           </w:p>
         </w:tc>
@@ -4669,7 +4669,7 @@
           </w:tcPr>
           <w:p>
             <w:r>
-              <w:t>Foreground Masking/ESO120-012_portrait_mask_report/ESO120-012_foreground_removed.pdf when no --names or --all selection is supplied.</w:t>
+              <w:t>Foreground Masking/ESO120-012_portrait_mask_report/ESO120-012_fg_removed_sp-gated.pdf when no --names or --all selection is supplied.</w:t>
             </w:r>
           </w:p>
         </w:tc>

</xml_diff>

<commit_message>
remove sourcextractor++, replace with SEP references
</commit_message>
<xml_diff>
--- a/Foreground Masking/documentation/Bar Spike-Gated Foreground Candidate Report Documentation.docx
+++ b/Foreground Masking/documentation/Bar Spike-Gated Foreground Candidate Report Documentation.docx
@@ -168,7 +168,7 @@
           </w:tcPr>
           <w:p>
             <w:r>
-              <w:t>C:\Users\gordo\Documents\Github\PythonScripts\Foreground Masking\bar_spike_gated_foreground_report.py</w:t>
+              <w:t>C:\Users\gordo\Documents\GitHub\PythonScripts\Foreground Masking\bar_spike_gated_foreground_report.py</w:t>
             </w:r>
           </w:p>
         </w:tc>
@@ -211,7 +211,7 @@
           </w:tcPr>
           <w:p>
             <w:r>
-              <w:t>2026-07-08</w:t>
+              <w:t>2026-07-19</w:t>
             </w:r>
           </w:p>
         </w:tc>
@@ -2441,7 +2441,7 @@
           </w:tcPr>
           <w:p>
             <w:r>
-              <w:t>12.0</w:t>
+              <w:t>8.0</w:t>
             </w:r>
           </w:p>
         </w:tc>
@@ -2458,7 +2458,7 @@
           </w:tcPr>
           <w:p>
             <w:r>
-              <w:t>Rejects residual segments whose centroids lie too close to the galaxy centre.</w:t>
+              <w:t>Rejects candidates whose dilated footprint touches the deprojected central exclusion zone.</w:t>
             </w:r>
           </w:p>
         </w:tc>

</xml_diff>

<commit_message>
updating and removing old code on PhotUtils and non-optimised SEP
</commit_message>
<xml_diff>
--- a/Foreground Masking/documentation/Bar Spike-Gated Foreground Candidate Report Documentation.docx
+++ b/Foreground Masking/documentation/Bar Spike-Gated Foreground Candidate Report Documentation.docx
@@ -168,7 +168,7 @@
           </w:tcPr>
           <w:p>
             <w:r>
-              <w:t>C:\Users\gordo\Documents\GitHub\PythonScripts\Foreground Masking\bar_spike_gated_foreground_report.py</w:t>
+              <w:t>C:\Users\gordo\Documents\Github\PythonScripts\Foreground Masking\bar_spike_gated_foreground_report.py</w:t>
             </w:r>
           </w:p>
         </w:tc>
@@ -211,7 +211,7 @@
           </w:tcPr>
           <w:p>
             <w:r>
-              <w:t>2026-07-19</w:t>
+              <w:t>2026-07-22</w:t>
             </w:r>
           </w:p>
         </w:tc>
@@ -2536,7 +2536,7 @@
         <w:pStyle w:val="Heading1"/>
       </w:pPr>
       <w:r>
-        <w:t>PDF Report Layout</w:t>
+        <w:t>PNG Report Layout</w:t>
       </w:r>
     </w:p>
     <w:tbl>
@@ -4566,7 +4566,7 @@
               <w:rPr>
                 <w:b/>
               </w:rPr>
-              <w:t>{galaxy_name}_fg_removed_sp-gated.pdf and .png</w:t>
+              <w:t>{galaxy_name}_fg_removed_sp-gated.png</w:t>
             </w:r>
           </w:p>
         </w:tc>
@@ -4583,7 +4583,7 @@
           </w:tcPr>
           <w:p>
             <w:r>
-              <w:t>Portrait report and PNG preview for one galaxy. The method suffix identifies the spike-gated masking run.</w:t>
+              <w:t>Portrait PNG report for one galaxy. The method suffix identifies the spike-gated masking run.</w:t>
             </w:r>
           </w:p>
         </w:tc>
@@ -4669,7 +4669,7 @@
           </w:tcPr>
           <w:p>
             <w:r>
-              <w:t>Foreground Masking/ESO120-012_portrait_mask_report/ESO120-012_fg_removed_sp-gated.pdf when no --names or --all selection is supplied.</w:t>
+              <w:t>Foreground Masking/ESO120-012_portrait_mask_report/ESO120-012_fg_removed_sp-gated.png when no --names or --all selection is supplied.</w:t>
             </w:r>
           </w:p>
         </w:tc>

</xml_diff>